<commit_message>
Add Gemini LLM fallback parser for unstructured university marking schemes
</commit_message>
<xml_diff>
--- a/data/uploads/rubric.docx
+++ b/data/uploads/rubric.docx
@@ -4,7 +4,32 @@
   <w:body>
     <w:p>
       <w:r>
-        <w:t>Question 1: Explain the different ways an application works, including application programming.</w:t>
+        <w:t>Question 1: Draw the ER diagram for the RESTAURANT system.</w:t>
+      </w:r>
+    </w:p>
+    <w:p>
+      <w:r>
+        <w:t>Max Marks: 10</w:t>
+      </w:r>
+    </w:p>
+    <w:p>
+      <w:r>
+        <w:t>Type: flexible</w:t>
+      </w:r>
+    </w:p>
+    <w:p>
+      <w:r>
+        <w:t>Answer: The diagram must include core entities such as RESTAURANT, OWNER, CUSTOMER, DISHES (with sub-categories like veg/non-veg or cuisines), and ORDER. It should also include relationships connecting the CUSTOMER to ORDER, and identify relevant attributes for these entities.</w:t>
+      </w:r>
+    </w:p>
+    <w:p>
+      <w:r>
+        <w:t>Components: Identified RESTAURANT, OWNER, and CUSTOMER entities: 4 Identified DISHES and ORDER entities with their sub-types or categories: 3 Identified relationships connecting CUSTOMER to other entities (like ORDER): 3</w:t>
+      </w:r>
+    </w:p>
+    <w:p>
+      <w:r>
+        <w:t>Question 2: Explain the different ways an application works, including application programming.</w:t>
       </w:r>
     </w:p>
     <w:p>
@@ -25,31 +50,6 @@
     <w:p>
       <w:r>
         <w:t>Components: Mentioned Application Programming: 2 Mentioned Poly Programming: 1 Mentioned user controls or interface queries: 2</w:t>
-      </w:r>
-    </w:p>
-    <w:p>
-      <w:r>
-        <w:t>Question 2: Draw the ER diagram for the RESTAURANT system.</w:t>
-      </w:r>
-    </w:p>
-    <w:p>
-      <w:r>
-        <w:t>Max Marks: 10</w:t>
-      </w:r>
-    </w:p>
-    <w:p>
-      <w:r>
-        <w:t>Type: flexible</w:t>
-      </w:r>
-    </w:p>
-    <w:p>
-      <w:r>
-        <w:t>Answer: The diagram must include core entities such as RESTAURANT, OWNER, CUSTOMER, DISHES (with sub-categories like veg/non-veg or cuisines), and ORDER. It should also include relationships connecting the CUSTOMER to ORDER, and identify relevant attributes for these entities.</w:t>
-      </w:r>
-    </w:p>
-    <w:p>
-      <w:r>
-        <w:t>Components: Identified RESTAURANT, OWNER, and CUSTOMER entities: 4 Identified DISHES and ORDER entities with their sub-types or categories: 3 Identified relationships connecting CUSTOMER to other entities (like ORDER): 3</w:t>
       </w:r>
     </w:p>
     <w:sectPr>

</xml_diff>